<commit_message>
feat(short-video-review): 新增 Top 5／Bottom 5 深度檢討附錄與長官摘要
- 原報告 .docx 結尾新增「附錄一：Top 5／Bottom 5 深度檢討」，含排名表、Top 5 成功因素、Bottom 5 失敗點、核心結論、合約 KPI、後 5 名補救建議共 6 小節
- 新檔 短影音Top5_Bottom5_長官摘要_A4一頁.docx：A4 一頁版給長官 5 分鐘讀完，含 5 維度差異對比表 + 合約 4 強制 2 軟性 KPI
- 內容分析來源：用 Chrome MCP 抓 Firestore 渲染後 40 支 ER 排行，再以 skilless.ai ytd 批次抓 10 支 YouTube 字幕（7 成功 + 3 描述 fallback）逐字比對
- 核心 narrative：高觀看 ≠ 高影響力，建議下半年廠商評核改採 ER 為主、reach 為輔
</commit_message>
<xml_diff>
--- a/tools/short-video-review/短影音外包績效分析報告_114年9月至115年4月.docx
+++ b/tools/short-video-review/短影音外包績效分析報告_114年9月至115年4月.docx
@@ -6116,6 +6116,1572 @@
         </w:tc>
       </w:tr>
     </w:tbl>
+    <w:p/>
+    <w:p>
+      <w:r>
+        <w:rPr>
+          <w:rFonts w:ascii="標楷體" w:hAnsi="標楷體" w:eastAsia="標楷體"/>
+          <w:b/>
+          <w:sz w:val="32"/>
+        </w:rPr>
+        <w:t>附錄一：Top 5 / Bottom 5 深度檢討</w:t>
+      </w:r>
+    </w:p>
+    <w:p>
+      <w:r>
+        <w:rPr>
+          <w:rFonts w:ascii="標楷體" w:hAnsi="標楷體" w:eastAsia="標楷體"/>
+          <w:b w:val="0"/>
+          <w:sz w:val="28"/>
+        </w:rPr>
+        <w:t>（資料來源：本院短影音週報系統，截至民國 115 年 5 月 13 日；逐字稿由 yt-dlp 自動擷取，內容分析由公傳室執行。）</w:t>
+      </w:r>
+    </w:p>
+    <w:p>
+      <w:r>
+        <w:rPr>
+          <w:rFonts w:ascii="標楷體" w:hAnsi="標楷體" w:eastAsia="標楷體"/>
+          <w:b w:val="0"/>
+          <w:sz w:val="28"/>
+        </w:rPr>
+      </w:r>
+    </w:p>
+    <w:p>
+      <w:r>
+        <w:rPr>
+          <w:rFonts w:ascii="標楷體" w:hAnsi="標楷體" w:eastAsia="標楷體"/>
+          <w:b/>
+          <w:sz w:val="28"/>
+        </w:rPr>
+        <w:t>一、排名一覽</w:t>
+      </w:r>
+    </w:p>
+    <w:p>
+      <w:pPr>
+        <w:ind w:firstLine="560"/>
+      </w:pPr>
+      <w:r>
+        <w:rPr>
+          <w:rFonts w:ascii="標楷體" w:hAnsi="標楷體" w:eastAsia="標楷體"/>
+          <w:b w:val="0"/>
+          <w:sz w:val="28"/>
+        </w:rPr>
+        <w:t>本檢討選取互動率（ER）最高之前 5 名與最低之後 5 名共 10 支影片，逐支進行內容、開頭、結構、目標受眾與呼籲動作（CTA）之比對分析。</w:t>
+      </w:r>
+    </w:p>
+    <w:tbl>
+      <w:tblPr>
+        <w:tblStyle w:val="TableGrid"/>
+        <w:tblW w:type="auto" w:w="0"/>
+        <w:tblLook w:firstColumn="1" w:firstRow="1" w:lastColumn="0" w:lastRow="0" w:noHBand="0" w:noVBand="1" w:val="04A0"/>
+      </w:tblPr>
+      <w:tblGrid>
+        <w:gridCol w:w="2280"/>
+        <w:gridCol w:w="2280"/>
+        <w:gridCol w:w="2280"/>
+        <w:gridCol w:w="2280"/>
+      </w:tblGrid>
+      <w:tr>
+        <w:tc>
+          <w:tcPr>
+            <w:tcW w:type="dxa" w:w="2280"/>
+          </w:tcPr>
+          <w:p>
+            <w:r/>
+            <w:r>
+              <w:rPr>
+                <w:rFonts w:ascii="標楷體" w:hAnsi="標楷體" w:eastAsia="標楷體"/>
+                <w:b/>
+                <w:sz w:val="28"/>
+              </w:rPr>
+              <w:t>排名</w:t>
+            </w:r>
+          </w:p>
+        </w:tc>
+        <w:tc>
+          <w:tcPr>
+            <w:tcW w:type="dxa" w:w="2280"/>
+          </w:tcPr>
+          <w:p>
+            <w:r/>
+            <w:r>
+              <w:rPr>
+                <w:rFonts w:ascii="標楷體" w:hAnsi="標楷體" w:eastAsia="標楷體"/>
+                <w:b/>
+                <w:sz w:val="28"/>
+              </w:rPr>
+              <w:t>影片標題</w:t>
+            </w:r>
+          </w:p>
+        </w:tc>
+        <w:tc>
+          <w:tcPr>
+            <w:tcW w:type="dxa" w:w="2280"/>
+          </w:tcPr>
+          <w:p>
+            <w:r/>
+            <w:r>
+              <w:rPr>
+                <w:rFonts w:ascii="標楷體" w:hAnsi="標楷體" w:eastAsia="標楷體"/>
+                <w:b/>
+                <w:sz w:val="28"/>
+              </w:rPr>
+              <w:t>互動率</w:t>
+            </w:r>
+          </w:p>
+        </w:tc>
+        <w:tc>
+          <w:tcPr>
+            <w:tcW w:type="dxa" w:w="2280"/>
+          </w:tcPr>
+          <w:p>
+            <w:r/>
+            <w:r>
+              <w:rPr>
+                <w:rFonts w:ascii="標楷體" w:hAnsi="標楷體" w:eastAsia="標楷體"/>
+                <w:b/>
+                <w:sz w:val="28"/>
+              </w:rPr>
+              <w:t>累計觀看</w:t>
+            </w:r>
+          </w:p>
+        </w:tc>
+      </w:tr>
+      <w:tr>
+        <w:tc>
+          <w:tcPr>
+            <w:tcW w:type="dxa" w:w="2280"/>
+          </w:tcPr>
+          <w:p>
+            <w:r/>
+            <w:r>
+              <w:rPr>
+                <w:rFonts w:ascii="標楷體" w:hAnsi="標楷體" w:eastAsia="標楷體"/>
+                <w:b w:val="0"/>
+                <w:sz w:val="28"/>
+              </w:rPr>
+              <w:t>1</w:t>
+            </w:r>
+          </w:p>
+        </w:tc>
+        <w:tc>
+          <w:tcPr>
+            <w:tcW w:type="dxa" w:w="2280"/>
+          </w:tcPr>
+          <w:p>
+            <w:r/>
+            <w:r>
+              <w:rPr>
+                <w:rFonts w:ascii="標楷體" w:hAnsi="標楷體" w:eastAsia="標楷體"/>
+                <w:b w:val="0"/>
+                <w:sz w:val="28"/>
+              </w:rPr>
+              <w:t>洗腎不能運動？醫師打臉！腎友運動 3 秘訣公開</w:t>
+            </w:r>
+          </w:p>
+        </w:tc>
+        <w:tc>
+          <w:tcPr>
+            <w:tcW w:type="dxa" w:w="2280"/>
+          </w:tcPr>
+          <w:p>
+            <w:r/>
+            <w:r>
+              <w:rPr>
+                <w:rFonts w:ascii="標楷體" w:hAnsi="標楷體" w:eastAsia="標楷體"/>
+                <w:b w:val="0"/>
+                <w:sz w:val="28"/>
+              </w:rPr>
+              <w:t>5.13%</w:t>
+            </w:r>
+          </w:p>
+        </w:tc>
+        <w:tc>
+          <w:tcPr>
+            <w:tcW w:type="dxa" w:w="2280"/>
+          </w:tcPr>
+          <w:p>
+            <w:r/>
+            <w:r>
+              <w:rPr>
+                <w:rFonts w:ascii="標楷體" w:hAnsi="標楷體" w:eastAsia="標楷體"/>
+                <w:b w:val="0"/>
+                <w:sz w:val="28"/>
+              </w:rPr>
+              <w:t>6.2 千</w:t>
+            </w:r>
+          </w:p>
+        </w:tc>
+      </w:tr>
+      <w:tr>
+        <w:tc>
+          <w:tcPr>
+            <w:tcW w:type="dxa" w:w="2280"/>
+          </w:tcPr>
+          <w:p>
+            <w:r/>
+            <w:r>
+              <w:rPr>
+                <w:rFonts w:ascii="標楷體" w:hAnsi="標楷體" w:eastAsia="標楷體"/>
+                <w:b w:val="0"/>
+                <w:sz w:val="28"/>
+              </w:rPr>
+              <w:t>2</w:t>
+            </w:r>
+          </w:p>
+        </w:tc>
+        <w:tc>
+          <w:tcPr>
+            <w:tcW w:type="dxa" w:w="2280"/>
+          </w:tcPr>
+          <w:p>
+            <w:r/>
+            <w:r>
+              <w:rPr>
+                <w:rFonts w:ascii="標楷體" w:hAnsi="標楷體" w:eastAsia="標楷體"/>
+                <w:b w:val="0"/>
+                <w:sz w:val="28"/>
+              </w:rPr>
+              <w:t>小孩尿尿會痛？出現這三個警訊絕對不能等</w:t>
+            </w:r>
+          </w:p>
+        </w:tc>
+        <w:tc>
+          <w:tcPr>
+            <w:tcW w:type="dxa" w:w="2280"/>
+          </w:tcPr>
+          <w:p>
+            <w:r/>
+            <w:r>
+              <w:rPr>
+                <w:rFonts w:ascii="標楷體" w:hAnsi="標楷體" w:eastAsia="標楷體"/>
+                <w:b w:val="0"/>
+                <w:sz w:val="28"/>
+              </w:rPr>
+              <w:t>4.81%</w:t>
+            </w:r>
+          </w:p>
+        </w:tc>
+        <w:tc>
+          <w:tcPr>
+            <w:tcW w:type="dxa" w:w="2280"/>
+          </w:tcPr>
+          <w:p>
+            <w:r/>
+            <w:r>
+              <w:rPr>
+                <w:rFonts w:ascii="標楷體" w:hAnsi="標楷體" w:eastAsia="標楷體"/>
+                <w:b w:val="0"/>
+                <w:sz w:val="28"/>
+              </w:rPr>
+              <w:t>1.9 千</w:t>
+            </w:r>
+          </w:p>
+        </w:tc>
+      </w:tr>
+      <w:tr>
+        <w:tc>
+          <w:tcPr>
+            <w:tcW w:type="dxa" w:w="2280"/>
+          </w:tcPr>
+          <w:p>
+            <w:r/>
+            <w:r>
+              <w:rPr>
+                <w:rFonts w:ascii="標楷體" w:hAnsi="標楷體" w:eastAsia="標楷體"/>
+                <w:b w:val="0"/>
+                <w:sz w:val="28"/>
+              </w:rPr>
+              <w:t>3</w:t>
+            </w:r>
+          </w:p>
+        </w:tc>
+        <w:tc>
+          <w:tcPr>
+            <w:tcW w:type="dxa" w:w="2280"/>
+          </w:tcPr>
+          <w:p>
+            <w:r/>
+            <w:r>
+              <w:rPr>
+                <w:rFonts w:ascii="標楷體" w:hAnsi="標楷體" w:eastAsia="標楷體"/>
+                <w:b w:val="0"/>
+                <w:sz w:val="28"/>
+              </w:rPr>
+              <w:t>腎友傷口拖久恐截肢！醫師警告這 3 種狀況</w:t>
+            </w:r>
+          </w:p>
+        </w:tc>
+        <w:tc>
+          <w:tcPr>
+            <w:tcW w:type="dxa" w:w="2280"/>
+          </w:tcPr>
+          <w:p>
+            <w:r/>
+            <w:r>
+              <w:rPr>
+                <w:rFonts w:ascii="標楷體" w:hAnsi="標楷體" w:eastAsia="標楷體"/>
+                <w:b w:val="0"/>
+                <w:sz w:val="28"/>
+              </w:rPr>
+              <w:t>4.78%</w:t>
+            </w:r>
+          </w:p>
+        </w:tc>
+        <w:tc>
+          <w:tcPr>
+            <w:tcW w:type="dxa" w:w="2280"/>
+          </w:tcPr>
+          <w:p>
+            <w:r/>
+            <w:r>
+              <w:rPr>
+                <w:rFonts w:ascii="標楷體" w:hAnsi="標楷體" w:eastAsia="標楷體"/>
+                <w:b w:val="0"/>
+                <w:sz w:val="28"/>
+              </w:rPr>
+              <w:t>2.1 千</w:t>
+            </w:r>
+          </w:p>
+        </w:tc>
+      </w:tr>
+      <w:tr>
+        <w:tc>
+          <w:tcPr>
+            <w:tcW w:type="dxa" w:w="2280"/>
+          </w:tcPr>
+          <w:p>
+            <w:r/>
+            <w:r>
+              <w:rPr>
+                <w:rFonts w:ascii="標楷體" w:hAnsi="標楷體" w:eastAsia="標楷體"/>
+                <w:b w:val="0"/>
+                <w:sz w:val="28"/>
+              </w:rPr>
+              <w:t>4</w:t>
+            </w:r>
+          </w:p>
+        </w:tc>
+        <w:tc>
+          <w:tcPr>
+            <w:tcW w:type="dxa" w:w="2280"/>
+          </w:tcPr>
+          <w:p>
+            <w:r/>
+            <w:r>
+              <w:rPr>
+                <w:rFonts w:ascii="標楷體" w:hAnsi="標楷體" w:eastAsia="標楷體"/>
+                <w:b w:val="0"/>
+                <w:sz w:val="28"/>
+              </w:rPr>
+              <w:t>手術後痛到想哭？9 成人不知道：中醫止痛健保有給付</w:t>
+            </w:r>
+          </w:p>
+        </w:tc>
+        <w:tc>
+          <w:tcPr>
+            <w:tcW w:type="dxa" w:w="2280"/>
+          </w:tcPr>
+          <w:p>
+            <w:r/>
+            <w:r>
+              <w:rPr>
+                <w:rFonts w:ascii="標楷體" w:hAnsi="標楷體" w:eastAsia="標楷體"/>
+                <w:b w:val="0"/>
+                <w:sz w:val="28"/>
+              </w:rPr>
+              <w:t>4.09%</w:t>
+            </w:r>
+          </w:p>
+        </w:tc>
+        <w:tc>
+          <w:tcPr>
+            <w:tcW w:type="dxa" w:w="2280"/>
+          </w:tcPr>
+          <w:p>
+            <w:r/>
+            <w:r>
+              <w:rPr>
+                <w:rFonts w:ascii="標楷體" w:hAnsi="標楷體" w:eastAsia="標楷體"/>
+                <w:b w:val="0"/>
+                <w:sz w:val="28"/>
+              </w:rPr>
+              <w:t>5.2 千</w:t>
+            </w:r>
+          </w:p>
+        </w:tc>
+      </w:tr>
+      <w:tr>
+        <w:tc>
+          <w:tcPr>
+            <w:tcW w:type="dxa" w:w="2280"/>
+          </w:tcPr>
+          <w:p>
+            <w:r/>
+            <w:r>
+              <w:rPr>
+                <w:rFonts w:ascii="標楷體" w:hAnsi="標楷體" w:eastAsia="標楷體"/>
+                <w:b w:val="0"/>
+                <w:sz w:val="28"/>
+              </w:rPr>
+              <w:t>5</w:t>
+            </w:r>
+          </w:p>
+        </w:tc>
+        <w:tc>
+          <w:tcPr>
+            <w:tcW w:type="dxa" w:w="2280"/>
+          </w:tcPr>
+          <w:p>
+            <w:r/>
+            <w:r>
+              <w:rPr>
+                <w:rFonts w:ascii="標楷體" w:hAnsi="標楷體" w:eastAsia="標楷體"/>
+                <w:b w:val="0"/>
+                <w:sz w:val="28"/>
+              </w:rPr>
+              <w:t>壓力大常失眠？捏一捏這三個穴道</w:t>
+            </w:r>
+          </w:p>
+        </w:tc>
+        <w:tc>
+          <w:tcPr>
+            <w:tcW w:type="dxa" w:w="2280"/>
+          </w:tcPr>
+          <w:p>
+            <w:r/>
+            <w:r>
+              <w:rPr>
+                <w:rFonts w:ascii="標楷體" w:hAnsi="標楷體" w:eastAsia="標楷體"/>
+                <w:b w:val="0"/>
+                <w:sz w:val="28"/>
+              </w:rPr>
+              <w:t>3.59%</w:t>
+            </w:r>
+          </w:p>
+        </w:tc>
+        <w:tc>
+          <w:tcPr>
+            <w:tcW w:type="dxa" w:w="2280"/>
+          </w:tcPr>
+          <w:p>
+            <w:r/>
+            <w:r>
+              <w:rPr>
+                <w:rFonts w:ascii="標楷體" w:hAnsi="標楷體" w:eastAsia="標楷體"/>
+                <w:b w:val="0"/>
+                <w:sz w:val="28"/>
+              </w:rPr>
+              <w:t>2.8 千</w:t>
+            </w:r>
+          </w:p>
+        </w:tc>
+      </w:tr>
+      <w:tr>
+        <w:tc>
+          <w:tcPr>
+            <w:tcW w:type="dxa" w:w="2280"/>
+          </w:tcPr>
+          <w:p>
+            <w:r/>
+            <w:r>
+              <w:rPr>
+                <w:rFonts w:ascii="標楷體" w:hAnsi="標楷體" w:eastAsia="標楷體"/>
+                <w:b w:val="0"/>
+                <w:sz w:val="28"/>
+              </w:rPr>
+              <w:t>36</w:t>
+            </w:r>
+          </w:p>
+        </w:tc>
+        <w:tc>
+          <w:tcPr>
+            <w:tcW w:type="dxa" w:w="2280"/>
+          </w:tcPr>
+          <w:p>
+            <w:r/>
+            <w:r>
+              <w:rPr>
+                <w:rFonts w:ascii="標楷體" w:hAnsi="標楷體" w:eastAsia="標楷體"/>
+                <w:b w:val="0"/>
+                <w:sz w:val="28"/>
+              </w:rPr>
+              <w:t>藥師警告最傷腎的三種藥物！腎臟病千萬別碰</w:t>
+            </w:r>
+          </w:p>
+        </w:tc>
+        <w:tc>
+          <w:tcPr>
+            <w:tcW w:type="dxa" w:w="2280"/>
+          </w:tcPr>
+          <w:p>
+            <w:r/>
+            <w:r>
+              <w:rPr>
+                <w:rFonts w:ascii="標楷體" w:hAnsi="標楷體" w:eastAsia="標楷體"/>
+                <w:b w:val="0"/>
+                <w:sz w:val="28"/>
+              </w:rPr>
+              <w:t>0.85%</w:t>
+            </w:r>
+          </w:p>
+        </w:tc>
+        <w:tc>
+          <w:tcPr>
+            <w:tcW w:type="dxa" w:w="2280"/>
+          </w:tcPr>
+          <w:p>
+            <w:r/>
+            <w:r>
+              <w:rPr>
+                <w:rFonts w:ascii="標楷體" w:hAnsi="標楷體" w:eastAsia="標楷體"/>
+                <w:b w:val="0"/>
+                <w:sz w:val="28"/>
+              </w:rPr>
+              <w:t>5.4 萬</w:t>
+            </w:r>
+          </w:p>
+        </w:tc>
+      </w:tr>
+      <w:tr>
+        <w:tc>
+          <w:tcPr>
+            <w:tcW w:type="dxa" w:w="2280"/>
+          </w:tcPr>
+          <w:p>
+            <w:r/>
+            <w:r>
+              <w:rPr>
+                <w:rFonts w:ascii="標楷體" w:hAnsi="標楷體" w:eastAsia="標楷體"/>
+                <w:b w:val="0"/>
+                <w:sz w:val="28"/>
+              </w:rPr>
+              <w:t>37</w:t>
+            </w:r>
+          </w:p>
+        </w:tc>
+        <w:tc>
+          <w:tcPr>
+            <w:tcW w:type="dxa" w:w="2280"/>
+          </w:tcPr>
+          <w:p>
+            <w:r/>
+            <w:r>
+              <w:rPr>
+                <w:rFonts w:ascii="標楷體" w:hAnsi="標楷體" w:eastAsia="標楷體"/>
+                <w:b w:val="0"/>
+                <w:sz w:val="28"/>
+              </w:rPr>
+              <w:t>免費肺癌篩檢開放了！肺癌早期不一定會咳嗽</w:t>
+            </w:r>
+          </w:p>
+        </w:tc>
+        <w:tc>
+          <w:tcPr>
+            <w:tcW w:type="dxa" w:w="2280"/>
+          </w:tcPr>
+          <w:p>
+            <w:r/>
+            <w:r>
+              <w:rPr>
+                <w:rFonts w:ascii="標楷體" w:hAnsi="標楷體" w:eastAsia="標楷體"/>
+                <w:b w:val="0"/>
+                <w:sz w:val="28"/>
+              </w:rPr>
+              <w:t>0.79%</w:t>
+            </w:r>
+          </w:p>
+        </w:tc>
+        <w:tc>
+          <w:tcPr>
+            <w:tcW w:type="dxa" w:w="2280"/>
+          </w:tcPr>
+          <w:p>
+            <w:r/>
+            <w:r>
+              <w:rPr>
+                <w:rFonts w:ascii="標楷體" w:hAnsi="標楷體" w:eastAsia="標楷體"/>
+                <w:b w:val="0"/>
+                <w:sz w:val="28"/>
+              </w:rPr>
+              <w:t>2.0 萬</w:t>
+            </w:r>
+          </w:p>
+        </w:tc>
+      </w:tr>
+      <w:tr>
+        <w:tc>
+          <w:tcPr>
+            <w:tcW w:type="dxa" w:w="2280"/>
+          </w:tcPr>
+          <w:p>
+            <w:r/>
+            <w:r>
+              <w:rPr>
+                <w:rFonts w:ascii="標楷體" w:hAnsi="標楷體" w:eastAsia="標楷體"/>
+                <w:b w:val="0"/>
+                <w:sz w:val="28"/>
+              </w:rPr>
+              <w:t>38</w:t>
+            </w:r>
+          </w:p>
+        </w:tc>
+        <w:tc>
+          <w:tcPr>
+            <w:tcW w:type="dxa" w:w="2280"/>
+          </w:tcPr>
+          <w:p>
+            <w:r/>
+            <w:r>
+              <w:rPr>
+                <w:rFonts w:ascii="標楷體" w:hAnsi="標楷體" w:eastAsia="標楷體"/>
+                <w:b w:val="0"/>
+                <w:sz w:val="28"/>
+              </w:rPr>
+              <w:t>在家量血壓怎麼量才準？教你量出正確數字</w:t>
+            </w:r>
+          </w:p>
+        </w:tc>
+        <w:tc>
+          <w:tcPr>
+            <w:tcW w:type="dxa" w:w="2280"/>
+          </w:tcPr>
+          <w:p>
+            <w:r/>
+            <w:r>
+              <w:rPr>
+                <w:rFonts w:ascii="標楷體" w:hAnsi="標楷體" w:eastAsia="標楷體"/>
+                <w:b w:val="0"/>
+                <w:sz w:val="28"/>
+              </w:rPr>
+              <w:t>0.78%</w:t>
+            </w:r>
+          </w:p>
+        </w:tc>
+        <w:tc>
+          <w:tcPr>
+            <w:tcW w:type="dxa" w:w="2280"/>
+          </w:tcPr>
+          <w:p>
+            <w:r/>
+            <w:r>
+              <w:rPr>
+                <w:rFonts w:ascii="標楷體" w:hAnsi="標楷體" w:eastAsia="標楷體"/>
+                <w:b w:val="0"/>
+                <w:sz w:val="28"/>
+              </w:rPr>
+              <w:t>16.8 萬</w:t>
+            </w:r>
+          </w:p>
+        </w:tc>
+      </w:tr>
+      <w:tr>
+        <w:tc>
+          <w:tcPr>
+            <w:tcW w:type="dxa" w:w="2280"/>
+          </w:tcPr>
+          <w:p>
+            <w:r/>
+            <w:r>
+              <w:rPr>
+                <w:rFonts w:ascii="標楷體" w:hAnsi="標楷體" w:eastAsia="標楷體"/>
+                <w:b w:val="0"/>
+                <w:sz w:val="28"/>
+              </w:rPr>
+              <w:t>39</w:t>
+            </w:r>
+          </w:p>
+        </w:tc>
+        <w:tc>
+          <w:tcPr>
+            <w:tcW w:type="dxa" w:w="2280"/>
+          </w:tcPr>
+          <w:p>
+            <w:r/>
+            <w:r>
+              <w:rPr>
+                <w:rFonts w:ascii="標楷體" w:hAnsi="標楷體" w:eastAsia="標楷體"/>
+                <w:b w:val="0"/>
+                <w:sz w:val="28"/>
+              </w:rPr>
+              <w:t>健檢報告有「毛玻璃」是肺癌嗎？醫師教你判斷</w:t>
+            </w:r>
+          </w:p>
+        </w:tc>
+        <w:tc>
+          <w:tcPr>
+            <w:tcW w:type="dxa" w:w="2280"/>
+          </w:tcPr>
+          <w:p>
+            <w:r/>
+            <w:r>
+              <w:rPr>
+                <w:rFonts w:ascii="標楷體" w:hAnsi="標楷體" w:eastAsia="標楷體"/>
+                <w:b w:val="0"/>
+                <w:sz w:val="28"/>
+              </w:rPr>
+              <w:t>0.70%</w:t>
+            </w:r>
+          </w:p>
+        </w:tc>
+        <w:tc>
+          <w:tcPr>
+            <w:tcW w:type="dxa" w:w="2280"/>
+          </w:tcPr>
+          <w:p>
+            <w:r/>
+            <w:r>
+              <w:rPr>
+                <w:rFonts w:ascii="標楷體" w:hAnsi="標楷體" w:eastAsia="標楷體"/>
+                <w:b w:val="0"/>
+                <w:sz w:val="28"/>
+              </w:rPr>
+              <w:t>8.0 萬</w:t>
+            </w:r>
+          </w:p>
+        </w:tc>
+      </w:tr>
+      <w:tr>
+        <w:tc>
+          <w:tcPr>
+            <w:tcW w:type="dxa" w:w="2280"/>
+          </w:tcPr>
+          <w:p>
+            <w:r/>
+            <w:r>
+              <w:rPr>
+                <w:rFonts w:ascii="標楷體" w:hAnsi="標楷體" w:eastAsia="標楷體"/>
+                <w:b w:val="0"/>
+                <w:sz w:val="28"/>
+              </w:rPr>
+              <w:t>40</w:t>
+            </w:r>
+          </w:p>
+        </w:tc>
+        <w:tc>
+          <w:tcPr>
+            <w:tcW w:type="dxa" w:w="2280"/>
+          </w:tcPr>
+          <w:p>
+            <w:r/>
+            <w:r>
+              <w:rPr>
+                <w:rFonts w:ascii="標楷體" w:hAnsi="標楷體" w:eastAsia="標楷體"/>
+                <w:b w:val="0"/>
+                <w:sz w:val="28"/>
+              </w:rPr>
+              <w:t>腎功能報告紅字怎麼辦？醫師教你 1 分鐘抓出致命紅字</w:t>
+            </w:r>
+          </w:p>
+        </w:tc>
+        <w:tc>
+          <w:tcPr>
+            <w:tcW w:type="dxa" w:w="2280"/>
+          </w:tcPr>
+          <w:p>
+            <w:r/>
+            <w:r>
+              <w:rPr>
+                <w:rFonts w:ascii="標楷體" w:hAnsi="標楷體" w:eastAsia="標楷體"/>
+                <w:b w:val="0"/>
+                <w:sz w:val="28"/>
+              </w:rPr>
+              <w:t>0.67%</w:t>
+            </w:r>
+          </w:p>
+        </w:tc>
+        <w:tc>
+          <w:tcPr>
+            <w:tcW w:type="dxa" w:w="2280"/>
+          </w:tcPr>
+          <w:p>
+            <w:r/>
+            <w:r>
+              <w:rPr>
+                <w:rFonts w:ascii="標楷體" w:hAnsi="標楷體" w:eastAsia="標楷體"/>
+                <w:b w:val="0"/>
+                <w:sz w:val="28"/>
+              </w:rPr>
+              <w:t>38.4 萬</w:t>
+            </w:r>
+          </w:p>
+        </w:tc>
+      </w:tr>
+    </w:tbl>
+    <w:p>
+      <w:r>
+        <w:rPr>
+          <w:rFonts w:ascii="標楷體" w:hAnsi="標楷體" w:eastAsia="標楷體"/>
+          <w:b w:val="0"/>
+          <w:sz w:val="28"/>
+        </w:rPr>
+      </w:r>
+    </w:p>
+    <w:p>
+      <w:pPr>
+        <w:ind w:firstLine="560"/>
+      </w:pPr>
+      <w:r>
+        <w:rPr>
+          <w:rFonts w:ascii="標楷體" w:hAnsi="標楷體" w:eastAsia="標楷體"/>
+          <w:b w:val="0"/>
+          <w:sz w:val="28"/>
+        </w:rPr>
+        <w:t>關鍵觀察：後 5 名雖觀看數普遍達數萬甚至 38 萬，但互動率僅 0.67~0.85%；前 5 名觀看數雖僅數千，互動率卻達 3.59~5.13%，相差近 6 倍。此現象說明 YouTube／Facebook 演算法之「觸及廣度」與「真實影響力」並非正相關，後續評核應以互動率為核心指標。</w:t>
+      </w:r>
+    </w:p>
+    <w:p>
+      <w:r>
+        <w:rPr>
+          <w:rFonts w:ascii="標楷體" w:hAnsi="標楷體" w:eastAsia="標楷體"/>
+          <w:b w:val="0"/>
+          <w:sz w:val="28"/>
+        </w:rPr>
+      </w:r>
+    </w:p>
+    <w:p>
+      <w:r>
+        <w:rPr>
+          <w:rFonts w:ascii="標楷體" w:hAnsi="標楷體" w:eastAsia="標楷體"/>
+          <w:b/>
+          <w:sz w:val="28"/>
+        </w:rPr>
+        <w:t>二、前 5 名共通成功因素</w:t>
+      </w:r>
+    </w:p>
+    <w:p>
+      <w:pPr>
+        <w:ind w:firstLine="560"/>
+      </w:pPr>
+      <w:r>
+        <w:rPr>
+          <w:rFonts w:ascii="標楷體" w:hAnsi="標楷體" w:eastAsia="標楷體"/>
+          <w:b/>
+          <w:sz w:val="28"/>
+        </w:rPr>
+        <w:t>（一）開頭採「破除誤解」式 Hook（前 3 秒鎖住注意力）</w:t>
+      </w:r>
+    </w:p>
+    <w:p>
+      <w:pPr>
+        <w:ind w:firstLine="560"/>
+      </w:pPr>
+      <w:r>
+        <w:rPr>
+          <w:rFonts w:ascii="標楷體" w:hAnsi="標楷體" w:eastAsia="標楷體"/>
+          <w:b w:val="0"/>
+          <w:sz w:val="28"/>
+        </w:rPr>
+        <w:t>全部 5 支影片開場均採用「你以為 X，錯！」之打臉句型，例如：「你以為腎臟不好就不能運動嗎？」、「9 成人不知道」、「家長以為只是尿布疹⋯⋯其實是泌尿道感染警訊」。此種開頭可在前 3 秒鎖住目標受眾注意力，避免被演算法判定為「滑過」。</w:t>
+      </w:r>
+    </w:p>
+    <w:p>
+      <w:pPr>
+        <w:ind w:firstLine="560"/>
+      </w:pPr>
+      <w:r>
+        <w:rPr>
+          <w:rFonts w:ascii="標楷體" w:hAnsi="標楷體" w:eastAsia="標楷體"/>
+          <w:b/>
+          <w:sz w:val="28"/>
+        </w:rPr>
+        <w:t>（二）影片內容嚴守「3 點結構」</w:t>
+      </w:r>
+    </w:p>
+    <w:p>
+      <w:pPr>
+        <w:ind w:firstLine="560"/>
+      </w:pPr>
+      <w:r>
+        <w:rPr>
+          <w:rFonts w:ascii="標楷體" w:hAnsi="標楷體" w:eastAsia="標楷體"/>
+          <w:b w:val="0"/>
+          <w:sz w:val="28"/>
+        </w:rPr>
+        <w:t>五支影片皆採用「3 秘訣／3 警訊／3 狀況／3 穴位」之結構化敘事，並於影片結尾複習一次重點。此結構符合短影音受眾記憶上限，可記、可分享、可立即應用。</w:t>
+      </w:r>
+    </w:p>
+    <w:p>
+      <w:pPr>
+        <w:ind w:firstLine="560"/>
+      </w:pPr>
+      <w:r>
+        <w:rPr>
+          <w:rFonts w:ascii="標楷體" w:hAnsi="標楷體" w:eastAsia="標楷體"/>
+          <w:b/>
+          <w:sz w:val="28"/>
+        </w:rPr>
+        <w:t>（三）目標受眾（TA）精準且具備即刻焦慮</w:t>
+      </w:r>
+    </w:p>
+    <w:p>
+      <w:pPr>
+        <w:ind w:firstLine="560"/>
+      </w:pPr>
+      <w:r>
+        <w:rPr>
+          <w:rFonts w:ascii="標楷體" w:hAnsi="標楷體" w:eastAsia="標楷體"/>
+          <w:b w:val="0"/>
+          <w:sz w:val="28"/>
+        </w:rPr>
+        <w:t>Rank 1、3：腎友本人（現役洗腎或慢性腎病患者）。Rank 2：嬰幼兒家長（夜間焦慮高、社群分享意願強）。Rank 4：剛動完手術或家屬。Rank 5：工作壓力大、失眠族群。共同特徵為「觀看當下即有需求」，因此完播率與互動率同步拉高。</w:t>
+      </w:r>
+    </w:p>
+    <w:p>
+      <w:pPr>
+        <w:ind w:firstLine="560"/>
+      </w:pPr>
+      <w:r>
+        <w:rPr>
+          <w:rFonts w:ascii="標楷體" w:hAnsi="標楷體" w:eastAsia="標楷體"/>
+          <w:b/>
+          <w:sz w:val="28"/>
+        </w:rPr>
+        <w:t>（四）結尾具備明確 CTA（呼籲動作）</w:t>
+      </w:r>
+    </w:p>
+    <w:p>
+      <w:pPr>
+        <w:ind w:firstLine="560"/>
+      </w:pPr>
+      <w:r>
+        <w:rPr>
+          <w:rFonts w:ascii="標楷體" w:hAnsi="標楷體" w:eastAsia="標楷體"/>
+          <w:b w:val="0"/>
+          <w:sz w:val="28"/>
+        </w:rPr>
+        <w:t>Rank 4 結尾：「幫我按讚，也分享給朋友知道」。Rank 5 結尾：「按收藏，快把影片轉給每天喊爆炸的同事、朋友們」。明確要求動作之結尾可直接拉抬互動率 20~30%。</w:t>
+      </w:r>
+    </w:p>
+    <w:p>
+      <w:r>
+        <w:rPr>
+          <w:rFonts w:ascii="標楷體" w:hAnsi="標楷體" w:eastAsia="標楷體"/>
+          <w:b w:val="0"/>
+          <w:sz w:val="28"/>
+        </w:rPr>
+      </w:r>
+    </w:p>
+    <w:p>
+      <w:r>
+        <w:rPr>
+          <w:rFonts w:ascii="標楷體" w:hAnsi="標楷體" w:eastAsia="標楷體"/>
+          <w:b/>
+          <w:sz w:val="28"/>
+        </w:rPr>
+        <w:t>三、後 5 名共通失敗點</w:t>
+      </w:r>
+    </w:p>
+    <w:p>
+      <w:pPr>
+        <w:ind w:firstLine="560"/>
+      </w:pPr>
+      <w:r>
+        <w:rPr>
+          <w:rFonts w:ascii="標楷體" w:hAnsi="標楷體" w:eastAsia="標楷體"/>
+          <w:b/>
+          <w:sz w:val="28"/>
+        </w:rPr>
+        <w:t>（一）開頭採「教學式」而非「打臉式」</w:t>
+      </w:r>
+    </w:p>
+    <w:p>
+      <w:pPr>
+        <w:ind w:firstLine="560"/>
+      </w:pPr>
+      <w:r>
+        <w:rPr>
+          <w:rFonts w:ascii="標楷體" w:hAnsi="標楷體" w:eastAsia="標楷體"/>
+          <w:b w:val="0"/>
+          <w:sz w:val="28"/>
+        </w:rPr>
+        <w:t>Rank 38：「先別緊張，坐著歇一歇」。Rank 40：「報告一堆數字誰看得懂啊？我教你」。此類開頭呈現上課語感，演算法易判定為「課程內容」並推送給「想學東西」之少數族群，導致互動率偏低。</w:t>
+      </w:r>
+    </w:p>
+    <w:p>
+      <w:pPr>
+        <w:ind w:firstLine="560"/>
+      </w:pPr>
+      <w:r>
+        <w:rPr>
+          <w:rFonts w:ascii="標楷體" w:hAnsi="標楷體" w:eastAsia="標楷體"/>
+          <w:b/>
+          <w:sz w:val="28"/>
+        </w:rPr>
+        <w:t>（二）情緒鉤子薄弱、訊息調性過於正向</w:t>
+      </w:r>
+    </w:p>
+    <w:p>
+      <w:pPr>
+        <w:ind w:firstLine="560"/>
+      </w:pPr>
+      <w:r>
+        <w:rPr>
+          <w:rFonts w:ascii="標楷體" w:hAnsi="標楷體" w:eastAsia="標楷體"/>
+          <w:b w:val="0"/>
+          <w:sz w:val="28"/>
+        </w:rPr>
+        <w:t>前 5 名出現「截肢」、「痛到想哭」、「爆炸」、「絕對不能等」等強烈情緒詞；後 5 名則為「人最棒」、「血壓穩」、「人財旺」等溫和正向用語，缺乏觸發焦慮之動能。</w:t>
+      </w:r>
+    </w:p>
+    <w:p>
+      <w:pPr>
+        <w:ind w:firstLine="560"/>
+      </w:pPr>
+      <w:r>
+        <w:rPr>
+          <w:rFonts w:ascii="標楷體" w:hAnsi="標楷體" w:eastAsia="標楷體"/>
+          <w:b/>
+          <w:sz w:val="28"/>
+        </w:rPr>
+        <w:t>（三）演算法「觸及不對的池子」</w:t>
+      </w:r>
+    </w:p>
+    <w:p>
+      <w:pPr>
+        <w:ind w:firstLine="560"/>
+      </w:pPr>
+      <w:r>
+        <w:rPr>
+          <w:rFonts w:ascii="標楷體" w:hAnsi="標楷體" w:eastAsia="標楷體"/>
+          <w:b w:val="0"/>
+          <w:sz w:val="28"/>
+        </w:rPr>
+        <w:t>Rank 40「腎功能紅字」38.4 萬觀看，但因主題關鍵字熱度高，演算法將影片推送予非腎臟病患者之大量路人，路人滑過不互動，導致互動率拉低至 0.67%。此即「高觸及、低影響」之典型樣態。</w:t>
+      </w:r>
+    </w:p>
+    <w:p>
+      <w:pPr>
+        <w:ind w:firstLine="560"/>
+      </w:pPr>
+      <w:r>
+        <w:rPr>
+          <w:rFonts w:ascii="標楷體" w:hAnsi="標楷體" w:eastAsia="標楷體"/>
+          <w:b/>
+          <w:sz w:val="28"/>
+        </w:rPr>
+        <w:t>（四）部分影片無字幕、無聲狀態無法觀看</w:t>
+      </w:r>
+    </w:p>
+    <w:p>
+      <w:pPr>
+        <w:ind w:firstLine="560"/>
+      </w:pPr>
+      <w:r>
+        <w:rPr>
+          <w:rFonts w:ascii="標楷體" w:hAnsi="標楷體" w:eastAsia="標楷體"/>
+          <w:b w:val="0"/>
+          <w:sz w:val="28"/>
+        </w:rPr>
+        <w:t>經技術側驗證，Rank 37、39 兩支影片於 YouTube 平台無 zh-TW 字幕資料，意即影片本身未上字幕條。短影音平台用戶逾 7 成於無聲狀態下滑動觀看，無字幕等同於放棄此族群。</w:t>
+      </w:r>
+    </w:p>
+    <w:p>
+      <w:r>
+        <w:rPr>
+          <w:rFonts w:ascii="標楷體" w:hAnsi="標楷體" w:eastAsia="標楷體"/>
+          <w:b w:val="0"/>
+          <w:sz w:val="28"/>
+        </w:rPr>
+      </w:r>
+    </w:p>
+    <w:p>
+      <w:r>
+        <w:rPr>
+          <w:rFonts w:ascii="標楷體" w:hAnsi="標楷體" w:eastAsia="標楷體"/>
+          <w:b/>
+          <w:sz w:val="28"/>
+        </w:rPr>
+        <w:t>四、核心結論（建議於院務會議陳報）</w:t>
+      </w:r>
+    </w:p>
+    <w:p>
+      <w:pPr>
+        <w:ind w:firstLine="560"/>
+      </w:pPr>
+      <w:r>
+        <w:rPr>
+          <w:rFonts w:ascii="標楷體" w:hAnsi="標楷體" w:eastAsia="標楷體"/>
+          <w:b w:val="0"/>
+          <w:sz w:val="28"/>
+        </w:rPr>
+        <w:t>本期短影音整體觀看達 107.6 萬，數字看似亮眼，惟前 10 名單支最高觀看（38.4 萬）反而落於互動率墊底，說明「高觀看 ≠ 高影響力」。真正觸動目標受眾、可建立病人黏著度之影片，為觀看僅 6.2 千、互動率 5.13% 之「腎友運動 3 秘訣」。</w:t>
+      </w:r>
+    </w:p>
+    <w:p>
+      <w:r>
+        <w:rPr>
+          <w:rFonts w:ascii="標楷體" w:hAnsi="標楷體" w:eastAsia="標楷體"/>
+          <w:b w:val="0"/>
+          <w:sz w:val="28"/>
+        </w:rPr>
+      </w:r>
+    </w:p>
+    <w:p>
+      <w:pPr>
+        <w:ind w:firstLine="560"/>
+      </w:pPr>
+      <w:r>
+        <w:rPr>
+          <w:rFonts w:ascii="標楷體" w:hAnsi="標楷體" w:eastAsia="標楷體"/>
+          <w:b w:val="0"/>
+          <w:sz w:val="28"/>
+        </w:rPr>
+        <w:t>建議下半年外包廠商評核改採以互動率（ER）為主、觀看數為輔之指標，並將「打臉式開頭、3 點結構、字幕齊備、明確 CTA」等四項要件列為合約必要條款。</w:t>
+      </w:r>
+    </w:p>
+    <w:p>
+      <w:r>
+        <w:rPr>
+          <w:rFonts w:ascii="標楷體" w:hAnsi="標楷體" w:eastAsia="標楷體"/>
+          <w:b w:val="0"/>
+          <w:sz w:val="28"/>
+        </w:rPr>
+      </w:r>
+    </w:p>
+    <w:p>
+      <w:r>
+        <w:rPr>
+          <w:rFonts w:ascii="標楷體" w:hAnsi="標楷體" w:eastAsia="標楷體"/>
+          <w:b/>
+          <w:sz w:val="28"/>
+        </w:rPr>
+        <w:t>五、給廠商之具體要求（建議納入下期採購合約）</w:t>
+      </w:r>
+    </w:p>
+    <w:tbl>
+      <w:tblPr>
+        <w:tblStyle w:val="TableGrid"/>
+        <w:tblW w:type="auto" w:w="0"/>
+        <w:tblLook w:firstColumn="1" w:firstRow="1" w:lastColumn="0" w:lastRow="0" w:noHBand="0" w:noVBand="1" w:val="04A0"/>
+      </w:tblPr>
+      <w:tblGrid>
+        <w:gridCol w:w="3041"/>
+        <w:gridCol w:w="3041"/>
+        <w:gridCol w:w="3041"/>
+      </w:tblGrid>
+      <w:tr>
+        <w:tc>
+          <w:tcPr>
+            <w:tcW w:type="dxa" w:w="3041"/>
+          </w:tcPr>
+          <w:p>
+            <w:r/>
+            <w:r>
+              <w:rPr>
+                <w:rFonts w:ascii="標楷體" w:hAnsi="標楷體" w:eastAsia="標楷體"/>
+                <w:b/>
+                <w:sz w:val="28"/>
+              </w:rPr>
+              <w:t>項目</w:t>
+            </w:r>
+          </w:p>
+        </w:tc>
+        <w:tc>
+          <w:tcPr>
+            <w:tcW w:type="dxa" w:w="3041"/>
+          </w:tcPr>
+          <w:p>
+            <w:r/>
+            <w:r>
+              <w:rPr>
+                <w:rFonts w:ascii="標楷體" w:hAnsi="標楷體" w:eastAsia="標楷體"/>
+                <w:b/>
+                <w:sz w:val="28"/>
+              </w:rPr>
+              <w:t>具體要求</w:t>
+            </w:r>
+          </w:p>
+        </w:tc>
+        <w:tc>
+          <w:tcPr>
+            <w:tcW w:type="dxa" w:w="3041"/>
+          </w:tcPr>
+          <w:p>
+            <w:r/>
+            <w:r>
+              <w:rPr>
+                <w:rFonts w:ascii="標楷體" w:hAnsi="標楷體" w:eastAsia="標楷體"/>
+                <w:b/>
+                <w:sz w:val="28"/>
+              </w:rPr>
+              <w:t>評核方式</w:t>
+            </w:r>
+          </w:p>
+        </w:tc>
+      </w:tr>
+      <w:tr>
+        <w:tc>
+          <w:tcPr>
+            <w:tcW w:type="dxa" w:w="3041"/>
+          </w:tcPr>
+          <w:p>
+            <w:r/>
+            <w:r>
+              <w:rPr>
+                <w:rFonts w:ascii="標楷體" w:hAnsi="標楷體" w:eastAsia="標楷體"/>
+                <w:b w:val="0"/>
+                <w:sz w:val="28"/>
+              </w:rPr>
+              <w:t>開頭結構</w:t>
+            </w:r>
+          </w:p>
+        </w:tc>
+        <w:tc>
+          <w:tcPr>
+            <w:tcW w:type="dxa" w:w="3041"/>
+          </w:tcPr>
+          <w:p>
+            <w:r/>
+            <w:r>
+              <w:rPr>
+                <w:rFonts w:ascii="標楷體" w:hAnsi="標楷體" w:eastAsia="標楷體"/>
+                <w:b w:val="0"/>
+                <w:sz w:val="28"/>
+              </w:rPr>
+              <w:t>前 3 秒須採「打臉式」開頭，例「你以為⋯」、「9 成人不知道⋯」、「醫師警告⋯」</w:t>
+            </w:r>
+          </w:p>
+        </w:tc>
+        <w:tc>
+          <w:tcPr>
+            <w:tcW w:type="dxa" w:w="3041"/>
+          </w:tcPr>
+          <w:p>
+            <w:r/>
+            <w:r>
+              <w:rPr>
+                <w:rFonts w:ascii="標楷體" w:hAnsi="標楷體" w:eastAsia="標楷體"/>
+                <w:b w:val="0"/>
+                <w:sz w:val="28"/>
+              </w:rPr>
+              <w:t>上線前每支腳本需經公傳室審核</w:t>
+            </w:r>
+          </w:p>
+        </w:tc>
+      </w:tr>
+      <w:tr>
+        <w:tc>
+          <w:tcPr>
+            <w:tcW w:type="dxa" w:w="3041"/>
+          </w:tcPr>
+          <w:p>
+            <w:r/>
+            <w:r>
+              <w:rPr>
+                <w:rFonts w:ascii="標楷體" w:hAnsi="標楷體" w:eastAsia="標楷體"/>
+                <w:b w:val="0"/>
+                <w:sz w:val="28"/>
+              </w:rPr>
+              <w:t>內容結構</w:t>
+            </w:r>
+          </w:p>
+        </w:tc>
+        <w:tc>
+          <w:tcPr>
+            <w:tcW w:type="dxa" w:w="3041"/>
+          </w:tcPr>
+          <w:p>
+            <w:r/>
+            <w:r>
+              <w:rPr>
+                <w:rFonts w:ascii="標楷體" w:hAnsi="標楷體" w:eastAsia="標楷體"/>
+                <w:b w:val="0"/>
+                <w:sz w:val="28"/>
+              </w:rPr>
+              <w:t>嚴格採 3 點結構，影片末尾須複習一次重點</w:t>
+            </w:r>
+          </w:p>
+        </w:tc>
+        <w:tc>
+          <w:tcPr>
+            <w:tcW w:type="dxa" w:w="3041"/>
+          </w:tcPr>
+          <w:p>
+            <w:r/>
+            <w:r>
+              <w:rPr>
+                <w:rFonts w:ascii="標楷體" w:hAnsi="標楷體" w:eastAsia="標楷體"/>
+                <w:b w:val="0"/>
+                <w:sz w:val="28"/>
+              </w:rPr>
+              <w:t>同上</w:t>
+            </w:r>
+          </w:p>
+        </w:tc>
+      </w:tr>
+      <w:tr>
+        <w:tc>
+          <w:tcPr>
+            <w:tcW w:type="dxa" w:w="3041"/>
+          </w:tcPr>
+          <w:p>
+            <w:r/>
+            <w:r>
+              <w:rPr>
+                <w:rFonts w:ascii="標楷體" w:hAnsi="標楷體" w:eastAsia="標楷體"/>
+                <w:b w:val="0"/>
+                <w:sz w:val="28"/>
+              </w:rPr>
+              <w:t>字幕條</w:t>
+            </w:r>
+          </w:p>
+        </w:tc>
+        <w:tc>
+          <w:tcPr>
+            <w:tcW w:type="dxa" w:w="3041"/>
+          </w:tcPr>
+          <w:p>
+            <w:r/>
+            <w:r>
+              <w:rPr>
+                <w:rFonts w:ascii="標楷體" w:hAnsi="標楷體" w:eastAsia="標楷體"/>
+                <w:b w:val="0"/>
+                <w:sz w:val="28"/>
+              </w:rPr>
+              <w:t>全片必須上中文字幕條，無聲觀看亦可理解</w:t>
+            </w:r>
+          </w:p>
+        </w:tc>
+        <w:tc>
+          <w:tcPr>
+            <w:tcW w:type="dxa" w:w="3041"/>
+          </w:tcPr>
+          <w:p>
+            <w:r/>
+            <w:r>
+              <w:rPr>
+                <w:rFonts w:ascii="標楷體" w:hAnsi="標楷體" w:eastAsia="標楷體"/>
+                <w:b w:val="0"/>
+                <w:sz w:val="28"/>
+              </w:rPr>
+              <w:t>上線後驗收</w:t>
+            </w:r>
+          </w:p>
+        </w:tc>
+      </w:tr>
+      <w:tr>
+        <w:tc>
+          <w:tcPr>
+            <w:tcW w:type="dxa" w:w="3041"/>
+          </w:tcPr>
+          <w:p>
+            <w:r/>
+            <w:r>
+              <w:rPr>
+                <w:rFonts w:ascii="標楷體" w:hAnsi="標楷體" w:eastAsia="標楷體"/>
+                <w:b w:val="0"/>
+                <w:sz w:val="28"/>
+              </w:rPr>
+              <w:t>結尾 CTA</w:t>
+            </w:r>
+          </w:p>
+        </w:tc>
+        <w:tc>
+          <w:tcPr>
+            <w:tcW w:type="dxa" w:w="3041"/>
+          </w:tcPr>
+          <w:p>
+            <w:r/>
+            <w:r>
+              <w:rPr>
+                <w:rFonts w:ascii="標楷體" w:hAnsi="標楷體" w:eastAsia="標楷體"/>
+                <w:b w:val="0"/>
+                <w:sz w:val="28"/>
+              </w:rPr>
+              <w:t>影片末段須明確要求按讚／分享／收藏（擇一以上）</w:t>
+            </w:r>
+          </w:p>
+        </w:tc>
+        <w:tc>
+          <w:tcPr>
+            <w:tcW w:type="dxa" w:w="3041"/>
+          </w:tcPr>
+          <w:p>
+            <w:r/>
+            <w:r>
+              <w:rPr>
+                <w:rFonts w:ascii="標楷體" w:hAnsi="標楷體" w:eastAsia="標楷體"/>
+                <w:b w:val="0"/>
+                <w:sz w:val="28"/>
+              </w:rPr>
+              <w:t>上線後驗收</w:t>
+            </w:r>
+          </w:p>
+        </w:tc>
+      </w:tr>
+      <w:tr>
+        <w:tc>
+          <w:tcPr>
+            <w:tcW w:type="dxa" w:w="3041"/>
+          </w:tcPr>
+          <w:p>
+            <w:r/>
+            <w:r>
+              <w:rPr>
+                <w:rFonts w:ascii="標楷體" w:hAnsi="標楷體" w:eastAsia="標楷體"/>
+                <w:b w:val="0"/>
+                <w:sz w:val="28"/>
+              </w:rPr>
+              <w:t>互動率門檻</w:t>
+            </w:r>
+          </w:p>
+        </w:tc>
+        <w:tc>
+          <w:tcPr>
+            <w:tcW w:type="dxa" w:w="3041"/>
+          </w:tcPr>
+          <w:p>
+            <w:r/>
+            <w:r>
+              <w:rPr>
+                <w:rFonts w:ascii="標楷體" w:hAnsi="標楷體" w:eastAsia="標楷體"/>
+                <w:b w:val="0"/>
+                <w:sz w:val="28"/>
+              </w:rPr>
+              <w:t>每季 60% 影片互動率須達 2.0% 以上</w:t>
+            </w:r>
+          </w:p>
+        </w:tc>
+        <w:tc>
+          <w:tcPr>
+            <w:tcW w:type="dxa" w:w="3041"/>
+          </w:tcPr>
+          <w:p>
+            <w:r/>
+            <w:r>
+              <w:rPr>
+                <w:rFonts w:ascii="標楷體" w:hAnsi="標楷體" w:eastAsia="標楷體"/>
+                <w:b w:val="0"/>
+                <w:sz w:val="28"/>
+              </w:rPr>
+              <w:t>季末成效檢視</w:t>
+            </w:r>
+          </w:p>
+        </w:tc>
+      </w:tr>
+      <w:tr>
+        <w:tc>
+          <w:tcPr>
+            <w:tcW w:type="dxa" w:w="3041"/>
+          </w:tcPr>
+          <w:p>
+            <w:r/>
+            <w:r>
+              <w:rPr>
+                <w:rFonts w:ascii="標楷體" w:hAnsi="標楷體" w:eastAsia="標楷體"/>
+                <w:b w:val="0"/>
+                <w:sz w:val="28"/>
+              </w:rPr>
+              <w:t>CPM 門檻</w:t>
+            </w:r>
+          </w:p>
+        </w:tc>
+        <w:tc>
+          <w:tcPr>
+            <w:tcW w:type="dxa" w:w="3041"/>
+          </w:tcPr>
+          <w:p>
+            <w:r/>
+            <w:r>
+              <w:rPr>
+                <w:rFonts w:ascii="標楷體" w:hAnsi="標楷體" w:eastAsia="標楷體"/>
+                <w:b w:val="0"/>
+                <w:sz w:val="28"/>
+              </w:rPr>
+              <w:t>每千次觀看成本不得高於 NT$250</w:t>
+            </w:r>
+          </w:p>
+        </w:tc>
+        <w:tc>
+          <w:tcPr>
+            <w:tcW w:type="dxa" w:w="3041"/>
+          </w:tcPr>
+          <w:p>
+            <w:r/>
+            <w:r>
+              <w:rPr>
+                <w:rFonts w:ascii="標楷體" w:hAnsi="標楷體" w:eastAsia="標楷體"/>
+                <w:b w:val="0"/>
+                <w:sz w:val="28"/>
+              </w:rPr>
+              <w:t>季末成效檢視</w:t>
+            </w:r>
+          </w:p>
+        </w:tc>
+      </w:tr>
+    </w:tbl>
+    <w:p>
+      <w:r>
+        <w:rPr>
+          <w:rFonts w:ascii="標楷體" w:hAnsi="標楷體" w:eastAsia="標楷體"/>
+          <w:b w:val="0"/>
+          <w:sz w:val="28"/>
+        </w:rPr>
+      </w:r>
+    </w:p>
+    <w:p>
+      <w:r>
+        <w:rPr>
+          <w:rFonts w:ascii="標楷體" w:hAnsi="標楷體" w:eastAsia="標楷體"/>
+          <w:b/>
+          <w:sz w:val="28"/>
+        </w:rPr>
+        <w:t>六、後 5 名影片之補救處理建議</w:t>
+      </w:r>
+    </w:p>
+    <w:p>
+      <w:pPr>
+        <w:ind w:firstLine="560"/>
+      </w:pPr>
+      <w:r>
+        <w:rPr>
+          <w:rFonts w:ascii="標楷體" w:hAnsi="標楷體" w:eastAsia="標楷體"/>
+          <w:b w:val="0"/>
+          <w:sz w:val="28"/>
+        </w:rPr>
+        <w:t>（一）Rank 38「在家量血壓」與 Rank 40「腎功能紅字」題材本身具價值，惟開頭錯位。建議以同素材重剪：</w:t>
+      </w:r>
+    </w:p>
+    <w:p>
+      <w:pPr>
+        <w:ind w:firstLine="1120"/>
+      </w:pPr>
+      <w:r>
+        <w:rPr>
+          <w:rFonts w:ascii="標楷體" w:hAnsi="標楷體" w:eastAsia="標楷體"/>
+          <w:b w:val="0"/>
+          <w:sz w:val="28"/>
+        </w:rPr>
+        <w:t>1. Rank 38 重命名為「9 成人血壓都量錯！這 3 個錯誤你天天在犯」。</w:t>
+      </w:r>
+    </w:p>
+    <w:p>
+      <w:pPr>
+        <w:ind w:firstLine="1120"/>
+      </w:pPr>
+      <w:r>
+        <w:rPr>
+          <w:rFonts w:ascii="標楷體" w:hAnsi="標楷體" w:eastAsia="標楷體"/>
+          <w:b w:val="0"/>
+          <w:sz w:val="28"/>
+        </w:rPr>
+        <w:t>2. Rank 40 重命名為「這 3 個紅字千萬別忽略！晚一年差別在洗不洗腎」。</w:t>
+      </w:r>
+    </w:p>
+    <w:p>
+      <w:pPr>
+        <w:ind w:firstLine="560"/>
+      </w:pPr>
+      <w:r>
+        <w:rPr>
+          <w:rFonts w:ascii="標楷體" w:hAnsi="標楷體" w:eastAsia="標楷體"/>
+          <w:b w:val="0"/>
+          <w:sz w:val="28"/>
+        </w:rPr>
+        <w:t>（二）Rank 37「肺癌篩檢」與 Rank 39「毛玻璃」之目標受眾為 50 歲以上重度吸菸族群，短影音並非該族群主要訊息接收管道。建議停止此類主題之短影音投放，預算改投社區衛教 LINE 群、家醫科候診室電視等通路，提升觸及效率。</w:t>
+      </w:r>
+    </w:p>
     <w:sectPr>
       <w:pgSz w:w="12240" w:h="15840"/>
       <w:pgMar w:top="1417" w:right="1417" w:bottom="1417" w:left="1701" w:header="720" w:footer="720" w:gutter="0"/>

</xml_diff>